<commit_message>
Complete IR assignment workflow and verification
</commit_message>
<xml_diff>
--- a/report/Assignment2_Report.docx
+++ b/report/Assignment2_Report.docx
@@ -158,58 +158,33 @@
         <w:t>The system is a research and technical-article discovery application. It lets a user acquire a heterogeneous collection, prepare text, build and inspect an index, issue advanced queries, view PageRank-aware results, receive Top-K recommendations, and evaluate retrieval quality. The scope is deliberately small enough for a complete BITS Virtual Lab demonstration while retaining the full information-retrieval lifecycle.</w:t>
       </w:r>
     </w:p>
-    <w:tbl>
-      <w:tblPr>
-        <w:tblW w:type="dxa" w:w="9360"/>
-        <w:jc w:val="left"/>
-        <w:tblLayout w:type="fixed"/>
-        <w:tblLook w:firstColumn="1" w:firstRow="1" w:lastColumn="0" w:lastRow="0" w:noHBand="0" w:noVBand="1" w:val="04A0"/>
-        <w:tblInd w:w="120" w:type="dxa"/>
-      </w:tblPr>
-      <w:tblGrid>
-        <w:gridCol w:w="9360"/>
-      </w:tblGrid>
-      <w:tr>
-        <w:tc>
-          <w:tcPr>
-            <w:tcW w:type="dxa" w:w="9360"/>
-            <w:tcMar>
-              <w:top w:w="80" w:type="dxa"/>
-              <w:start w:w="120" w:type="dxa"/>
-              <w:bottom w:w="80" w:type="dxa"/>
-              <w:end w:w="120" w:type="dxa"/>
-            </w:tcMar>
-            <w:vAlign w:val="center"/>
-            <w:shd w:fill="F4F6F9"/>
-          </w:tcPr>
-          <w:p>
-            <w:pPr>
-              <w:spacing w:after="0"/>
-            </w:pPr>
-            <w:r>
-              <w:rPr>
-                <w:rFonts w:ascii="Calibri" w:hAnsi="Calibri"/>
-                <w:b/>
-                <w:i w:val="0"/>
-                <w:color w:val="0B2545"/>
-                <w:sz w:val="21"/>
-              </w:rPr>
-              <w:t xml:space="preserve">System boundary: </w:t>
-            </w:r>
-            <w:r>
-              <w:rPr>
-                <w:rFonts w:ascii="Calibri" w:hAnsi="Calibri"/>
-                <w:b w:val="0"/>
-                <w:i w:val="0"/>
-                <w:color w:val="0B2545"/>
-                <w:sz w:val="21"/>
-              </w:rPr>
-              <w:t>All collection, indexing, searching, ranking, recommendation, evaluation and analytics actions are triggered from the Streamlit interface. SQLite and JSON files are implementation storage, not a separate user-facing backend workflow.</w:t>
-            </w:r>
-          </w:p>
-        </w:tc>
-      </w:tr>
-    </w:tbl>
+    <w:p>
+      <w:pPr>
+        <w:shd w:fill="F4F6F9"/>
+        <w:spacing w:before="100" w:after="100"/>
+        <w:ind w:left="115" w:right="115"/>
+      </w:pPr>
+      <w:r>
+        <w:rPr>
+          <w:rFonts w:ascii="Calibri" w:hAnsi="Calibri"/>
+          <w:b/>
+          <w:i w:val="0"/>
+          <w:color w:val="0B2545"/>
+          <w:sz w:val="21"/>
+        </w:rPr>
+        <w:t xml:space="preserve">System boundary: </w:t>
+      </w:r>
+      <w:r>
+        <w:rPr>
+          <w:rFonts w:ascii="Calibri" w:hAnsi="Calibri"/>
+          <w:b w:val="0"/>
+          <w:i w:val="0"/>
+          <w:color w:val="0B2545"/>
+          <w:sz w:val="21"/>
+        </w:rPr>
+        <w:t>All collection, indexing, searching, ranking, recommendation, evaluation and analytics actions are triggered from the Streamlit interface. SQLite and JSON files are implementation storage, not a separate user-facing backend workflow.</w:t>
+      </w:r>
+    </w:p>
     <w:p>
       <w:pPr>
         <w:spacing w:after="40"/>
@@ -268,6 +243,9 @@
         <w:gridCol w:w="6660"/>
       </w:tblGrid>
       <w:tr>
+        <w:trPr>
+          <w:tblHeader w:val="true"/>
+        </w:trPr>
         <w:tc>
           <w:tcPr>
             <w:tcW w:type="dxa" w:w="2700"/>
@@ -488,7 +466,7 @@
                 <w:color w:val="000000"/>
                 <w:sz w:val="19"/>
               </w:rPr>
-              <w:t>Configurable depth/page limit; normalized URLs, SHA-256 content hashes and trigram-shingle Jaccard near-duplicate detection.</w:t>
+              <w:t>Configurable depth/page limit; public-URL and redirect validation; normalized URLs, SHA-256 content hashes and trigram-shingle Jaccard near-duplicate detection.</w:t>
             </w:r>
           </w:p>
         </w:tc>
@@ -656,7 +634,7 @@
                 <w:color w:val="000000"/>
                 <w:sz w:val="19"/>
               </w:rPr>
-              <w:t>TF-IDF cosine Top-K content scores plus an optional feedback-aware hybrid component.</w:t>
+              <w:t>Configurable Top-K TF-IDF cosine scores plus positive/negative feedback and an optional collaborative hybrid component.</w:t>
             </w:r>
           </w:p>
         </w:tc>
@@ -712,7 +690,7 @@
                 <w:color w:val="000000"/>
                 <w:sz w:val="19"/>
               </w:rPr>
-              <w:t>Precision, Recall, F1, P@K, R@K, MAP, MRR and NDCG@K, reported for BM25 and BM25 + PageRank.</w:t>
+              <w:t>Full-ranking Precision, Recall, F1, MAP and MRR plus P@K, R@K and NDCG@K, reported for BM25 and BM25 + PageRank.</w:t>
             </w:r>
           </w:p>
         </w:tc>
@@ -755,58 +733,33 @@
         <w:t>For the ranking experiment, the application first filters candidates using the inverted index and Boolean/phrase constraints. It then applies BM25. A normalized PageRank score from the stored link graph is blended at 20% with the normalized BM25 score. The slider permits a fair comparison with BM25-only ranking at 0% PageRank influence.</w:t>
       </w:r>
     </w:p>
-    <w:tbl>
-      <w:tblPr>
-        <w:tblW w:type="dxa" w:w="9360"/>
-        <w:jc w:val="left"/>
-        <w:tblLayout w:type="fixed"/>
-        <w:tblLook w:firstColumn="1" w:firstRow="1" w:lastColumn="0" w:lastRow="0" w:noHBand="0" w:noVBand="1" w:val="04A0"/>
-        <w:tblInd w:w="120" w:type="dxa"/>
-      </w:tblPr>
-      <w:tblGrid>
-        <w:gridCol w:w="9360"/>
-      </w:tblGrid>
-      <w:tr>
-        <w:tc>
-          <w:tcPr>
-            <w:tcW w:type="dxa" w:w="9360"/>
-            <w:tcMar>
-              <w:top w:w="80" w:type="dxa"/>
-              <w:start w:w="120" w:type="dxa"/>
-              <w:bottom w:w="80" w:type="dxa"/>
-              <w:end w:w="120" w:type="dxa"/>
-            </w:tcMar>
-            <w:vAlign w:val="center"/>
-            <w:shd w:fill="F4F6F9"/>
-          </w:tcPr>
-          <w:p>
-            <w:pPr>
-              <w:spacing w:after="0"/>
-            </w:pPr>
-            <w:r>
-              <w:rPr>
-                <w:rFonts w:ascii="Calibri" w:hAnsi="Calibri"/>
-                <w:b/>
-                <w:i w:val="0"/>
-                <w:color w:val="0B2545"/>
-                <w:sz w:val="21"/>
-              </w:rPr>
-              <w:t xml:space="preserve">Reproducibility: </w:t>
-            </w:r>
-            <w:r>
-              <w:rPr>
-                <w:rFonts w:ascii="Calibri" w:hAnsi="Calibri"/>
-                <w:b w:val="0"/>
-                <w:i w:val="0"/>
-                <w:color w:val="0B2545"/>
-                <w:sz w:val="21"/>
-              </w:rPr>
-              <w:t>Open Acquire &amp; Crawl → Demo dataset → Load or refresh demo corpus, then run Evaluation with the supplied qrels at K = 5. The values below are from that verified run; results will change when the corpus, qrels or weighting is changed.</w:t>
-            </w:r>
-          </w:p>
-        </w:tc>
-      </w:tr>
-    </w:tbl>
+    <w:p>
+      <w:pPr>
+        <w:shd w:fill="F4F6F9"/>
+        <w:spacing w:before="100" w:after="100"/>
+        <w:ind w:left="115" w:right="115"/>
+      </w:pPr>
+      <w:r>
+        <w:rPr>
+          <w:rFonts w:ascii="Calibri" w:hAnsi="Calibri"/>
+          <w:b/>
+          <w:i w:val="0"/>
+          <w:color w:val="0B2545"/>
+          <w:sz w:val="21"/>
+        </w:rPr>
+        <w:t xml:space="preserve">Reproducibility: </w:t>
+      </w:r>
+      <w:r>
+        <w:rPr>
+          <w:rFonts w:ascii="Calibri" w:hAnsi="Calibri"/>
+          <w:b w:val="0"/>
+          <w:i w:val="0"/>
+          <w:color w:val="0B2545"/>
+          <w:sz w:val="21"/>
+        </w:rPr>
+        <w:t>Open Acquire &amp; Crawl → Demo dataset → Load or refresh demo corpus, then run Evaluation with the supplied qrels at K = 5. The values below are from that verified run; results will change when the corpus, qrels or weighting is changed.</w:t>
+      </w:r>
+    </w:p>
     <w:p>
       <w:pPr>
         <w:spacing w:after="40"/>
@@ -838,6 +791,9 @@
         <w:gridCol w:w="1140"/>
       </w:tblGrid>
       <w:tr>
+        <w:trPr>
+          <w:tblHeader w:val="true"/>
+        </w:trPr>
         <w:tc>
           <w:tcPr>
             <w:tcW w:type="dxa" w:w="2520"/>
@@ -1086,7 +1042,7 @@
                 <w:color w:val="000000"/>
                 <w:sz w:val="19"/>
               </w:rPr>
-              <w:t>0.853</w:t>
+              <w:t>0.400</w:t>
             </w:r>
           </w:p>
         </w:tc>
@@ -1140,7 +1096,7 @@
                 <w:color w:val="000000"/>
                 <w:sz w:val="19"/>
               </w:rPr>
-              <w:t>0.614</w:t>
+              <w:t>0.626</w:t>
             </w:r>
           </w:p>
         </w:tc>
@@ -1167,7 +1123,7 @@
                 <w:color w:val="000000"/>
                 <w:sz w:val="19"/>
               </w:rPr>
-              <w:t>0.508</w:t>
+              <w:t>0.536</w:t>
             </w:r>
           </w:p>
         </w:tc>
@@ -1277,7 +1233,7 @@
                 <w:color w:val="000000"/>
                 <w:sz w:val="19"/>
               </w:rPr>
-              <w:t>0.893</w:t>
+              <w:t>0.440</w:t>
             </w:r>
           </w:p>
         </w:tc>
@@ -1331,7 +1287,7 @@
                 <w:color w:val="000000"/>
                 <w:sz w:val="19"/>
               </w:rPr>
-              <w:t>0.659</w:t>
+              <w:t>0.626</w:t>
             </w:r>
           </w:p>
         </w:tc>
@@ -1432,7 +1388,7 @@
           <w:color w:val="000000"/>
           <w:sz w:val="22"/>
         </w:rPr>
-        <w:t>The PageRank blend improves the compact demonstration set on P@5 (+0.040), R@5 (+0.050), MAP (+0.040) and NDCG@5 (+0.051). It does not alter MRR because the first relevant result was already first in the evaluated queries. This is a useful result: authority signals help ordering and coverage, but should complement rather than replace lexical relevance.</w:t>
+        <w:t>The PageRank blend improves the compact demonstration set on P@5 (+0.040), R@5 (+0.050), MAP (+0.011) and NDCG@5 (+0.051). Full-ranking Precision, Recall and F1 are unchanged because both strategies retrieve the same candidate sets; PageRank changes their order. MRR is also unchanged because the first relevant result was already first. This is a useful result: authority signals improve early ordering and coverage, but complement rather than replace lexical relevance.</w:t>
       </w:r>
     </w:p>
     <w:tbl>
@@ -1451,6 +1407,9 @@
         <w:gridCol w:w="1440"/>
       </w:tblGrid>
       <w:tr>
+        <w:trPr>
+          <w:tblHeader w:val="true"/>
+        </w:trPr>
         <w:tc>
           <w:tcPr>
             <w:tcW w:type="dxa" w:w="3600"/>
@@ -1989,7 +1948,7 @@
           <w:color w:val="000000"/>
           <w:sz w:val="22"/>
         </w:rPr>
-        <w:t>The work shows that a good IR system is not a single algorithm. The baseline BM25 index provides a strong transparent starting point, but authority features changed the rank quality for the diagnostic query. The preprocessing comparison shows why feature choices control both vocabulary size and matching behavior. The duplicate checks and separate metadata/content storage improve reliability before a ranking model runs. Finally, the metric dashboard prevents overclaiming: the PageRank blend improved NDCG and recall in this small curated collection, but it must be retested on a larger, independently judged corpus before treating it as a general conclusion.</w:t>
+        <w:t>The work shows that a good IR system is not a single algorithm. The baseline BM25 index provides a strong transparent starting point, but authority features changed the rank quality for the diagnostic query. The preprocessing comparison shows why feature choices control both vocabulary size and matching behavior. The duplicate checks and separate metadata/content storage improve reliability before a ranking model runs. Finally, the metric dashboard prevents overclaiming: the PageRank blend improved NDCG@5 and Recall@5 in this small curated collection, but it must be retested on a larger, independently judged corpus before treating it as a general conclusion.</w:t>
       </w:r>
     </w:p>
     <w:p>
@@ -2000,208 +1959,108 @@
         <w:t>7. Virtual Lab demonstration evidence</w:t>
       </w:r>
     </w:p>
-    <w:tbl>
-      <w:tblPr>
-        <w:tblW w:type="dxa" w:w="9360"/>
-        <w:jc w:val="left"/>
-        <w:tblLayout w:type="fixed"/>
-        <w:tblLook w:firstColumn="1" w:firstRow="1" w:lastColumn="0" w:lastRow="0" w:noHBand="0" w:noVBand="1" w:val="04A0"/>
-        <w:tblInd w:w="120" w:type="dxa"/>
-      </w:tblPr>
-      <w:tblGrid>
-        <w:gridCol w:w="9360"/>
-      </w:tblGrid>
-      <w:tr>
-        <w:tc>
-          <w:tcPr>
-            <w:tcW w:type="dxa" w:w="9360"/>
-            <w:tcMar>
-              <w:top w:w="80" w:type="dxa"/>
-              <w:start w:w="120" w:type="dxa"/>
-              <w:bottom w:w="80" w:type="dxa"/>
-              <w:end w:w="120" w:type="dxa"/>
-            </w:tcMar>
-            <w:vAlign w:val="center"/>
-            <w:shd w:fill="F4F6F9"/>
-          </w:tcPr>
-          <w:p>
-            <w:pPr>
-              <w:spacing w:after="0"/>
-            </w:pPr>
-            <w:r>
-              <w:rPr>
-                <w:rFonts w:ascii="Calibri" w:hAnsi="Calibri"/>
-                <w:b/>
-                <w:i w:val="0"/>
-                <w:color w:val="0B2545"/>
-                <w:sz w:val="21"/>
-              </w:rPr>
-              <w:t xml:space="preserve">Student action required: </w:t>
-            </w:r>
-            <w:r>
-              <w:rPr>
-                <w:rFonts w:ascii="Calibri" w:hAnsi="Calibri"/>
-                <w:b w:val="0"/>
-                <w:i w:val="0"/>
-                <w:color w:val="0B2545"/>
-                <w:sz w:val="21"/>
-              </w:rPr>
-              <w:t>Run the app on the BITS Virtual Lab and replace the three placeholders below with your own screenshots. They cannot be truthfully generated outside your Virtual Lab session.</w:t>
-            </w:r>
-          </w:p>
-        </w:tc>
-      </w:tr>
-    </w:tbl>
+    <w:p>
+      <w:pPr>
+        <w:shd w:fill="F4F6F9"/>
+        <w:spacing w:before="100" w:after="100"/>
+        <w:ind w:left="115" w:right="115"/>
+      </w:pPr>
+      <w:r>
+        <w:rPr>
+          <w:rFonts w:ascii="Calibri" w:hAnsi="Calibri"/>
+          <w:b/>
+          <w:i w:val="0"/>
+          <w:color w:val="0B2545"/>
+          <w:sz w:val="21"/>
+        </w:rPr>
+        <w:t xml:space="preserve">Student action required: </w:t>
+      </w:r>
+      <w:r>
+        <w:rPr>
+          <w:rFonts w:ascii="Calibri" w:hAnsi="Calibri"/>
+          <w:b w:val="0"/>
+          <w:i w:val="0"/>
+          <w:color w:val="0B2545"/>
+          <w:sz w:val="21"/>
+        </w:rPr>
+        <w:t>Run the app on the BITS Virtual Lab and replace the three placeholders below with your own screenshots. They cannot be truthfully generated outside your Virtual Lab session.</w:t>
+      </w:r>
+    </w:p>
     <w:p>
       <w:pPr>
         <w:spacing w:after="40"/>
       </w:pPr>
     </w:p>
-    <w:tbl>
-      <w:tblPr>
-        <w:tblW w:type="dxa" w:w="9360"/>
-        <w:jc w:val="left"/>
-        <w:tblLayout w:type="fixed"/>
-        <w:tblLook w:firstColumn="1" w:firstRow="1" w:lastColumn="0" w:lastRow="0" w:noHBand="0" w:noVBand="1" w:val="04A0"/>
-        <w:tblInd w:w="120" w:type="dxa"/>
-      </w:tblPr>
-      <w:tblGrid>
-        <w:gridCol w:w="9360"/>
-      </w:tblGrid>
-      <w:tr>
-        <w:tc>
-          <w:tcPr>
-            <w:tcW w:type="dxa" w:w="9360"/>
-            <w:tcMar>
-              <w:top w:w="80" w:type="dxa"/>
-              <w:start w:w="120" w:type="dxa"/>
-              <w:bottom w:w="80" w:type="dxa"/>
-              <w:end w:w="120" w:type="dxa"/>
-            </w:tcMar>
-            <w:vAlign w:val="center"/>
-            <w:shd w:fill="FAFAFA"/>
-          </w:tcPr>
-          <w:p>
-            <w:pPr>
-              <w:spacing w:before="360" w:after="360"/>
-              <w:jc w:val="center"/>
-            </w:pPr>
-            <w:r>
-              <w:rPr>
-                <w:rFonts w:ascii="Calibri" w:hAnsi="Calibri"/>
-                <w:b w:val="0"/>
-                <w:i/>
-                <w:color w:val="595959"/>
-                <w:sz w:val="21"/>
-              </w:rPr>
-              <w:t>Screenshot 1 — Dashboard after loading the demo or chosen dataset. Show corpus count, vocabulary and acquisition-source chart.</w:t>
-              <w:br/>
-              <w:t>[Insert Virtual Lab screenshot here]</w:t>
-            </w:r>
-          </w:p>
-        </w:tc>
-      </w:tr>
-    </w:tbl>
+    <w:p>
+      <w:pPr>
+        <w:shd w:fill="FAFAFA"/>
+        <w:spacing w:before="360" w:after="360"/>
+        <w:ind w:left="173" w:right="173"/>
+        <w:jc w:val="center"/>
+      </w:pPr>
+      <w:r>
+        <w:rPr>
+          <w:rFonts w:ascii="Calibri" w:hAnsi="Calibri"/>
+          <w:b w:val="0"/>
+          <w:i/>
+          <w:color w:val="595959"/>
+          <w:sz w:val="21"/>
+        </w:rPr>
+        <w:t>Screenshot 1 — Dashboard after loading the demo or chosen dataset. Show corpus count, vocabulary and acquisition-source chart.</w:t>
+        <w:br/>
+        <w:t>[Insert Virtual Lab screenshot here]</w:t>
+      </w:r>
+    </w:p>
     <w:p>
       <w:pPr>
         <w:spacing w:after="60"/>
       </w:pPr>
     </w:p>
-    <w:tbl>
-      <w:tblPr>
-        <w:tblW w:type="dxa" w:w="9360"/>
-        <w:jc w:val="left"/>
-        <w:tblLayout w:type="fixed"/>
-        <w:tblLook w:firstColumn="1" w:firstRow="1" w:lastColumn="0" w:lastRow="0" w:noHBand="0" w:noVBand="1" w:val="04A0"/>
-        <w:tblInd w:w="120" w:type="dxa"/>
-      </w:tblPr>
-      <w:tblGrid>
-        <w:gridCol w:w="9360"/>
-      </w:tblGrid>
-      <w:tr>
-        <w:tc>
-          <w:tcPr>
-            <w:tcW w:type="dxa" w:w="9360"/>
-            <w:tcMar>
-              <w:top w:w="80" w:type="dxa"/>
-              <w:start w:w="120" w:type="dxa"/>
-              <w:bottom w:w="80" w:type="dxa"/>
-              <w:end w:w="120" w:type="dxa"/>
-            </w:tcMar>
-            <w:vAlign w:val="center"/>
-            <w:shd w:fill="FAFAFA"/>
-          </w:tcPr>
-          <w:p>
-            <w:pPr>
-              <w:spacing w:before="360" w:after="360"/>
-              <w:jc w:val="center"/>
-            </w:pPr>
-            <w:r>
-              <w:rPr>
-                <w:rFonts w:ascii="Calibri" w:hAnsi="Calibri"/>
-                <w:b w:val="0"/>
-                <w:i/>
-                <w:color w:val="595959"/>
-                <w:sz w:val="21"/>
-              </w:rPr>
-              <w:t>Screenshot 2 — Search &amp; Ranking for `ranking`. Show the BM25, PageRank and final scores with PageRank influence at 0.20.</w:t>
-              <w:br/>
-              <w:t>[Insert Virtual Lab screenshot here]</w:t>
-            </w:r>
-          </w:p>
-        </w:tc>
-      </w:tr>
-    </w:tbl>
+    <w:p>
+      <w:pPr>
+        <w:shd w:fill="FAFAFA"/>
+        <w:spacing w:before="360" w:after="360"/>
+        <w:ind w:left="173" w:right="173"/>
+        <w:jc w:val="center"/>
+      </w:pPr>
+      <w:r>
+        <w:rPr>
+          <w:rFonts w:ascii="Calibri" w:hAnsi="Calibri"/>
+          <w:b w:val="0"/>
+          <w:i/>
+          <w:color w:val="595959"/>
+          <w:sz w:val="21"/>
+        </w:rPr>
+        <w:t>Screenshot 2 — Search &amp; Ranking for `ranking`. Show the BM25, PageRank and final scores with PageRank influence at 0.20.</w:t>
+        <w:br/>
+        <w:t>[Insert Virtual Lab screenshot here]</w:t>
+      </w:r>
+    </w:p>
     <w:p>
       <w:pPr>
         <w:spacing w:after="60"/>
       </w:pPr>
     </w:p>
-    <w:tbl>
-      <w:tblPr>
-        <w:tblW w:type="dxa" w:w="9360"/>
-        <w:jc w:val="left"/>
-        <w:tblLayout w:type="fixed"/>
-        <w:tblLook w:firstColumn="1" w:firstRow="1" w:lastColumn="0" w:lastRow="0" w:noHBand="0" w:noVBand="1" w:val="04A0"/>
-        <w:tblInd w:w="120" w:type="dxa"/>
-      </w:tblPr>
-      <w:tblGrid>
-        <w:gridCol w:w="9360"/>
-      </w:tblGrid>
-      <w:tr>
-        <w:tc>
-          <w:tcPr>
-            <w:tcW w:type="dxa" w:w="9360"/>
-            <w:tcMar>
-              <w:top w:w="80" w:type="dxa"/>
-              <w:start w:w="120" w:type="dxa"/>
-              <w:bottom w:w="80" w:type="dxa"/>
-              <w:end w:w="120" w:type="dxa"/>
-            </w:tcMar>
-            <w:vAlign w:val="center"/>
-            <w:shd w:fill="FAFAFA"/>
-          </w:tcPr>
-          <w:p>
-            <w:pPr>
-              <w:spacing w:before="360" w:after="360"/>
-              <w:jc w:val="center"/>
-            </w:pPr>
-            <w:r>
-              <w:rPr>
-                <w:rFonts w:ascii="Calibri" w:hAnsi="Calibri"/>
-                <w:b w:val="0"/>
-                <w:i/>
-                <w:color w:val="595959"/>
-                <w:sz w:val="21"/>
-              </w:rPr>
-              <w:t>Screenshot 3 — Evaluation Dashboard at K = 5. Show the BM25 versus BM25 + PageRank metric table and chart.</w:t>
-              <w:br/>
-              <w:t>[Insert Virtual Lab screenshot here]</w:t>
-            </w:r>
-          </w:p>
-        </w:tc>
-      </w:tr>
-    </w:tbl>
+    <w:p>
+      <w:pPr>
+        <w:shd w:fill="FAFAFA"/>
+        <w:spacing w:before="360" w:after="360"/>
+        <w:ind w:left="173" w:right="173"/>
+        <w:jc w:val="center"/>
+      </w:pPr>
+      <w:r>
+        <w:rPr>
+          <w:rFonts w:ascii="Calibri" w:hAnsi="Calibri"/>
+          <w:b w:val="0"/>
+          <w:i/>
+          <w:color w:val="595959"/>
+          <w:sz w:val="21"/>
+        </w:rPr>
+        <w:t>Screenshot 3 — Evaluation Dashboard at K = 5. Show the BM25 versus BM25 + PageRank metric table and chart.</w:t>
+        <w:br/>
+        <w:t>[Insert Virtual Lab screenshot here]</w:t>
+      </w:r>
+    </w:p>
     <w:p>
       <w:pPr>
         <w:spacing w:after="60"/>
@@ -2224,61 +2083,36 @@
           <w:color w:val="000000"/>
           <w:sz w:val="22"/>
         </w:rPr>
-        <w:t>Create a virtual environment, install requirements, and run `streamlit run app.py`. The README lists every step and the required CSV schemas. For the demonstration, use the supplied data/sample_documents.csv and data/sample_qrels.csv or add a permitted domain/API/CSV collection through the acquisition page. No command other than starting Streamlit is needed for the normal front-end workflow.</w:t>
+        <w:t>Create a virtual environment, install requirements, and run `streamlit run app.py`. The README lists every step and the required CSV schemas. For the demonstration, use the supplied data/sample_documents.csv and data/sample_qrels.csv or add a permitted domain/API/CSV collection through the acquisition page. No command other than starting Streamlit is needed for the normal front-end workflow. Before submission, run `python -m unittest discover -s tests -v` to verify the core pipeline.</w:t>
       </w:r>
     </w:p>
-    <w:tbl>
-      <w:tblPr>
-        <w:tblW w:type="dxa" w:w="9360"/>
-        <w:jc w:val="left"/>
-        <w:tblLayout w:type="fixed"/>
-        <w:tblLook w:firstColumn="1" w:firstRow="1" w:lastColumn="0" w:lastRow="0" w:noHBand="0" w:noVBand="1" w:val="04A0"/>
-        <w:tblInd w:w="120" w:type="dxa"/>
-      </w:tblPr>
-      <w:tblGrid>
-        <w:gridCol w:w="9360"/>
-      </w:tblGrid>
-      <w:tr>
-        <w:tc>
-          <w:tcPr>
-            <w:tcW w:type="dxa" w:w="9360"/>
-            <w:tcMar>
-              <w:top w:w="80" w:type="dxa"/>
-              <w:start w:w="120" w:type="dxa"/>
-              <w:bottom w:w="80" w:type="dxa"/>
-              <w:end w:w="120" w:type="dxa"/>
-            </w:tcMar>
-            <w:vAlign w:val="center"/>
-            <w:shd w:fill="F4F6F9"/>
-          </w:tcPr>
-          <w:p>
-            <w:pPr>
-              <w:spacing w:after="0"/>
-            </w:pPr>
-            <w:r>
-              <w:rPr>
-                <w:rFonts w:ascii="Calibri" w:hAnsi="Calibri"/>
-                <w:b/>
-                <w:i w:val="0"/>
-                <w:color w:val="0B2545"/>
-                <w:sz w:val="21"/>
-              </w:rPr>
-              <w:t xml:space="preserve">Submission contents: </w:t>
-            </w:r>
-            <w:r>
-              <w:rPr>
-                <w:rFonts w:ascii="Calibri" w:hAnsi="Calibri"/>
-                <w:b w:val="0"/>
-                <w:i w:val="0"/>
-                <w:color w:val="0B2545"/>
-                <w:sz w:val="21"/>
-              </w:rPr>
-              <w:t>Submit app.py, requirements.txt, data/sample_documents.csv, data/sample_qrels.csv, README.md, this report after filling student details and screenshots, plus any additional dataset material used in your own run.</w:t>
-            </w:r>
-          </w:p>
-        </w:tc>
-      </w:tr>
-    </w:tbl>
+    <w:p>
+      <w:pPr>
+        <w:shd w:fill="F4F6F9"/>
+        <w:spacing w:before="100" w:after="100"/>
+        <w:ind w:left="115" w:right="115"/>
+      </w:pPr>
+      <w:r>
+        <w:rPr>
+          <w:rFonts w:ascii="Calibri" w:hAnsi="Calibri"/>
+          <w:b/>
+          <w:i w:val="0"/>
+          <w:color w:val="0B2545"/>
+          <w:sz w:val="21"/>
+        </w:rPr>
+        <w:t xml:space="preserve">Submission contents: </w:t>
+      </w:r>
+      <w:r>
+        <w:rPr>
+          <w:rFonts w:ascii="Calibri" w:hAnsi="Calibri"/>
+          <w:b w:val="0"/>
+          <w:i w:val="0"/>
+          <w:color w:val="0B2545"/>
+          <w:sz w:val="21"/>
+        </w:rPr>
+        <w:t>Submit app.py, requirements.txt, the tests folder, data/sample_documents.csv, data/sample_qrels.csv, README.md, this report after filling student details and screenshots, plus any additional dataset material used in your own run.</w:t>
+      </w:r>
+    </w:p>
     <w:p>
       <w:pPr>
         <w:spacing w:after="40"/>

</xml_diff>